<commit_message>
Fix Maria Sarmiento name replacement in CFD docs
</commit_message>
<xml_diff>
--- a/Project Rooms/Contract for Deed/reference/Rose memorandum prototype/320 Rose - Memorandum of Contract for Deed - PROTOTYPE.docx
+++ b/Project Rooms/Contract for Deed/reference/Rose memorandum prototype/320 Rose - Memorandum of Contract for Deed - PROTOTYPE.docx
@@ -282,6 +282,21 @@
         <w:rPr>
           <w:b/>
         </w:rPr>
+      </w:r>
+      <w:r>
+        <w:rPr>
+          <w:b w:val="0"/>
+        </w:rPr>
+      </w:r>
+      <w:r>
+        <w:rPr>
+          <w:b/>
+        </w:rPr>
+      </w:r>
+      <w:r>
+        <w:rPr>
+          <w:b/>
+        </w:rPr>
         <w:t>NORTH CAROLINA</w:t>
       </w:r>
       <w:r>
@@ -336,6 +351,26 @@
         <w:rPr>
           <w:b/>
           <w:bCs/>
+        </w:rPr>
+      </w:r>
+      <w:r>
+        <w:rPr>
+          <w:b/>
+        </w:rPr>
+      </w:r>
+      <w:r>
+        <w:rPr>
+          <w:b w:val="0"/>
+        </w:rPr>
+      </w:r>
+      <w:r>
+        <w:rPr>
+          <w:b/>
+        </w:rPr>
+      </w:r>
+      <w:r>
+        <w:rPr>
+          <w:b w:val="0"/>
         </w:rPr>
       </w:r>
       <w:r>
@@ -855,7 +890,7 @@
         <w:rPr>
           <w:b/>
         </w:rPr>
-        <w:t>Ever Cardoza and Maria Sarmjento (Purchaser).</w:t>
+        <w:t>Ever Cardoza and Maria Geraldina Sarmiento (Purchaser).</w:t>
       </w:r>
     </w:p>
     <w:p>
@@ -985,6 +1020,11 @@
         <w:rPr>
           <w:b/>
         </w:rPr>
+      </w:r>
+      <w:r>
+        <w:rPr>
+          <w:b/>
+        </w:rPr>
         <w:t xml:space="preserve"> 320 Rose Pl, Wendell, NC 27591</w:t>
       </w:r>
     </w:p>
@@ -1082,6 +1122,11 @@
         <w:rPr>
           <w:b/>
         </w:rPr>
+      </w:r>
+      <w:r>
+        <w:rPr>
+          <w:b/>
+        </w:rPr>
         <w:t>BEING all of Lot 95, Section 2, of Candlewick Subdivision, as depicted in Book of Maps 1974, Page 271, Wake County Registry</w:t>
       </w:r>
     </w:p>
@@ -1179,6 +1224,11 @@
         <w:rPr>
           <w:b/>
         </w:rPr>
+      </w:r>
+      <w:r>
+        <w:rPr>
+          <w:b/>
+        </w:rPr>
         <w:t>WAKE / 1765676891</w:t>
       </w:r>
     </w:p>
@@ -1284,6 +1334,11 @@
         <w:rPr>
           <w:b/>
         </w:rPr>
+      </w:r>
+      <w:r>
+        <w:rPr>
+          <w:b/>
+        </w:rPr>
         <w:t>7/1/2026</w:t>
       </w:r>
     </w:p>
@@ -1381,6 +1436,11 @@
         <w:rPr>
           <w:b/>
         </w:rPr>
+      </w:r>
+      <w:r>
+        <w:rPr>
+          <w:b/>
+        </w:rPr>
         <w:t>6/1/2056</w:t>
       </w:r>
     </w:p>
@@ -1393,6 +1453,11 @@
           <w:b/>
         </w:rPr>
         <w:t xml:space="preserve">Total Number of Installment Payments: </w:t>
+      </w:r>
+      <w:r>
+        <w:rPr>
+          <w:b/>
+        </w:rPr>
       </w:r>
       <w:r>
         <w:rPr>
@@ -1761,6 +1826,16 @@
         <w:rPr>
           <w:b/>
         </w:rPr>
+      </w:r>
+      <w:r>
+        <w:rPr>
+          <w:b/>
+        </w:rPr>
+      </w:r>
+      <w:r>
+        <w:rPr>
+          <w:b/>
+        </w:rPr>
         <w:t>Investment Services LLC</w:t>
       </w:r>
       <w:r>
@@ -1878,6 +1953,11 @@
         <w:rPr>
           <w:b/>
         </w:rPr>
+      </w:r>
+      <w:r>
+        <w:rPr>
+          <w:b/>
+        </w:rPr>
         <w:t>Al Bennett, Manager</w:t>
       </w:r>
     </w:p>
@@ -2057,6 +2137,16 @@
         <w:rPr>
           <w:b/>
         </w:rPr>
+      </w:r>
+      <w:r>
+        <w:rPr>
+          <w:b/>
+        </w:rPr>
+      </w:r>
+      <w:r>
+        <w:rPr>
+          <w:b/>
+        </w:rPr>
         <w:t>Investment Services LLC</w:t>
       </w:r>
       <w:r>
@@ -2335,6 +2425,16 @@
         <w:rPr>
           <w:b w:val="0"/>
         </w:rPr>
+      </w:r>
+      <w:r>
+        <w:rPr>
+          <w:b/>
+        </w:rPr>
+      </w:r>
+      <w:r>
+        <w:rPr>
+          <w:b w:val="0"/>
+        </w:rPr>
         <w:t xml:space="preserve"> </w:t>
       </w:r>
       <w:r>
@@ -2402,6 +2502,16 @@
         </w:rPr>
       </w:r>
       <w:proofErr w:type="spellEnd"/>
+      <w:r>
+        <w:rPr>
+          <w:b w:val="0"/>
+        </w:rPr>
+      </w:r>
+      <w:r>
+        <w:rPr>
+          <w:b/>
+        </w:rPr>
+      </w:r>
       <w:r>
         <w:rPr>
           <w:b w:val="0"/>

</xml_diff>